<commit_message>
Auto commit (2026-10-14 12:47) — 3 changes
Claude Code 세션 종료 시 자동 커밋.

Co-Authored-By: Claude <noreply@anthropic.com>
</commit_message>
<xml_diff>
--- a/projects/36_slave_dragon_king/노예라 불린 용의 공주_피칭페이지_v7.docx
+++ b/projects/36_slave_dragon_king/노예라 불린 용의 공주_피칭페이지_v7.docx
@@ -457,7 +457,7 @@
           <w:color w:val="1A1A1A"/>
           <w:sz w:val="22"/>
         </w:rPr>
-        <w:t>· 레퍼런스: 진짜 왕자가 "투기장에서 이겨 이 목줄을 벗겠다"며 스스로 싸우러 감. 자유에 대한 갈망.</w:t>
+        <w:t>· 레퍼런스: 진짜 왕자가 "투기장에서 이겨 이 목줄을 벗겠다"며 스스로 싸우러 감. 승리 및 자유에 대한 갈망.</w:t>
       </w:r>
     </w:p>
     <w:p>
@@ -473,7 +473,7 @@
           <w:color w:val="1A1A1A"/>
           <w:sz w:val="22"/>
         </w:rPr>
-        <w:t>· 변경: 아이비는 왕좌를 노리지 않음. 자기를 때리는 어머니도 챙기고, 가족이 화를 입을까 봐 굴욕을 참음. 주인공의 목적, 감정, 행동 원리를 다르게 가져감.</w:t>
+        <w:t>· 변경: 아이비를 부드러운 성격으로 설정. 착하지만 인정욕구도 있음. 자기를 때리는 어머니도 챙기고, 가족이 화를 입을까 봐 굴욕을 참음. 주인공의 목적, 감정, 행동 원리를 다르게 가져감. 이에 따라, ‘고구마’ 강도가 조금 높아짐.</w:t>
       </w:r>
     </w:p>
     <w:p>

</xml_diff>